<commit_message>
Evening calendar rebased to the real start: Tuesday, September 15
The teen signup sheet and the series outline dated the meetings by week-of
Mondays from Sep 14. The first evening is actually Tuesday Sep 15, so both
now carry true meeting dates, biweekly Tuesdays: Sep 15, Sep 29, Oct 13,
Oct 27, Nov 10, Nov 24 (Thanksgiving-week note kept), Dec 8, and on the
outline's longer ladder Dec 22 (Christmas note kept), Jan 5, Jan 19. The
'Week of' column is now 'Date', and 'Monday or Tuesday of each meeting
week' becomes 'Tuesdays, every other week, set with the families.' Signup
and outline updated in md and docx; OneDrive print copies synced.

Co-Authored-By: Claude Fable 5 <noreply@anthropic.com>
</commit_message>
<xml_diff>
--- a/_implementation-notes/FotH Pilot Evening Series Outline DRAFT v1.docx
+++ b/_implementation-notes/FotH Pilot Evening Series Outline DRAFT v1.docx
@@ -1010,7 +1010,7 @@
         <w:pStyle w:val="Heading2"/>
       </w:pPr>
       <w:r>
-        <w:t xml:space="preserve">6. The calendar ladder (Mon/Tue of each meeting week)</w:t>
+        <w:t xml:space="preserve">6. The calendar ladder (Tuesdays, every other week)</w:t>
       </w:r>
     </w:p>
     <w:tbl>
@@ -1046,7 +1046,7 @@
               <w:pStyle w:val="Compact"/>
             </w:pPr>
             <w:r>
-              <w:t xml:space="preserve">Week of</w:t>
+              <w:t xml:space="preserve">Date</w:t>
             </w:r>
           </w:p>
         </w:tc>
@@ -1081,7 +1081,7 @@
               <w:pStyle w:val="Compact"/>
             </w:pPr>
             <w:r>
-              <w:t xml:space="preserve">Sep 14</w:t>
+              <w:t xml:space="preserve">Sep 15</w:t>
             </w:r>
           </w:p>
         </w:tc>
@@ -1116,7 +1116,7 @@
               <w:pStyle w:val="Compact"/>
             </w:pPr>
             <w:r>
-              <w:t xml:space="preserve">Sep 28</w:t>
+              <w:t xml:space="preserve">Sep 29</w:t>
             </w:r>
           </w:p>
         </w:tc>
@@ -1148,7 +1148,7 @@
               <w:pStyle w:val="Compact"/>
             </w:pPr>
             <w:r>
-              <w:t xml:space="preserve">Oct 12</w:t>
+              <w:t xml:space="preserve">Oct 13</w:t>
             </w:r>
           </w:p>
         </w:tc>
@@ -1180,7 +1180,7 @@
               <w:pStyle w:val="Compact"/>
             </w:pPr>
             <w:r>
-              <w:t xml:space="preserve">Oct 26</w:t>
+              <w:t xml:space="preserve">Oct 27</w:t>
             </w:r>
           </w:p>
         </w:tc>
@@ -1212,7 +1212,7 @@
               <w:pStyle w:val="Compact"/>
             </w:pPr>
             <w:r>
-              <w:t xml:space="preserve">Nov 9</w:t>
+              <w:t xml:space="preserve">Nov 10</w:t>
             </w:r>
           </w:p>
         </w:tc>
@@ -1244,7 +1244,7 @@
               <w:pStyle w:val="Compact"/>
             </w:pPr>
             <w:r>
-              <w:t xml:space="preserve">Nov 23</w:t>
+              <w:t xml:space="preserve">Nov 24</w:t>
             </w:r>
           </w:p>
         </w:tc>
@@ -1279,7 +1279,7 @@
               <w:pStyle w:val="Compact"/>
             </w:pPr>
             <w:r>
-              <w:t xml:space="preserve">Dec 7</w:t>
+              <w:t xml:space="preserve">Dec 8</w:t>
             </w:r>
           </w:p>
         </w:tc>
@@ -1311,7 +1311,7 @@
               <w:pStyle w:val="Compact"/>
             </w:pPr>
             <w:r>
-              <w:t xml:space="preserve">Dec 21</w:t>
+              <w:t xml:space="preserve">Dec 22</w:t>
             </w:r>
           </w:p>
         </w:tc>
@@ -1346,7 +1346,7 @@
               <w:pStyle w:val="Compact"/>
             </w:pPr>
             <w:r>
-              <w:t xml:space="preserve">Jan 4</w:t>
+              <w:t xml:space="preserve">Jan 5</w:t>
             </w:r>
           </w:p>
         </w:tc>
@@ -1378,7 +1378,7 @@
               <w:pStyle w:val="Compact"/>
             </w:pPr>
             <w:r>
-              <w:t xml:space="preserve">Jan 18</w:t>
+              <w:t xml:space="preserve">Jan 19</w:t>
             </w:r>
           </w:p>
         </w:tc>

</xml_diff>